<commit_message>
Fix wording in manuscript draft
Co-Authored-By: Claude Sonnet 5.5 <noreply@anthropic.com>
Claude-Session: https://claude.ai/code/session_01Hv17up5m6zhCqJ5SAWN1gB
</commit_message>
<xml_diff>
--- a/isr_draft/ISR_manuscript_draft.docx
+++ b/isr_draft/ISR_manuscript_draft.docx
@@ -613,7 +613,7 @@
         <w:pStyle w:val="FirstParagraph"/>
       </w:pPr>
       <w:r>
-        <w:t xml:space="preserve">The design evolved over three stages. An initial 24-world pilot revealed that a task-request step in the advisory condition produced an artifact: agents adopted informal rotation rules, tasks went unfilled, and inequality in that condition reflected lost tasks and not governance. The request step was removed. A second 24-world pilot, run with the corrected design, showed that most elections had no candidate and that incumbents therefore persisted by default. We changed the rule so that an empty election vacates the office, and added the office-rent factor and the placebo gifted-vote measure. The pilots informed the final design and are not pooled with the main results. The design, models, and all analysis code are retained in a public repository, and per-call costs are logged.</w:t>
+        <w:t xml:space="preserve">The design evolved over three stages. An initial 24-world pilot revealed that a task-request step in the advisory condition produced an artifact: agents adopted informal rotation rules, tasks went unfilled, and inequality in that condition reflected lost tasks and not governance. The request step was removed. A second 24-world pilot, run with the corrected design, showed that most elections had no candidate and that incumbents therefore persisted by default. We changed the rule so that an empty election vacates the office, and added the office-rent factor and the placebo gifted-vote measure. The pilots informed the final design and are not pooled with the main results. The design, models, and all analysis code are retained in a repository, and per-call costs are logged.</w:t>
       </w:r>
     </w:p>
     <w:bookmarkEnd w:id="31"/>
@@ -1914,7 +1914,7 @@
         <w:pStyle w:val="FirstParagraph"/>
       </w:pPr>
       <w:r>
-        <w:t xml:space="preserve">Binding authority did not concentrate access. Under advisory authority, which is effectively a lottery, the Gini coefficient of tasks (0.110) and the longest spell without a task (12.3 days) matched the random benchmark (0.103 and 12.0). Under binding authority both were lower (0.083, p = 0.022; 10.4 days, p = 0.039): holders distributed tasks more evenly than chance would. The effect is probably understated, because in about 42 percent of election cycles the office was vacant and allocation reverted to a lottery even in the binding condition. In the earlier pilot, in which offices persisted by default, the same comparison showed far larger equalization (a Gini of 0.026 against 0.086). Authority binding did not alter persistence of control: the longest holder spell and the re-election rate were similar in the two conditions. Binding authority also halved the number of transfers (78 against 167, p = 0.002) and raised the share of promises honored (0.23 against 0.14, p = 0.036).</w:t>
+        <w:t xml:space="preserve">Binding authority did not concentrate access. Under advisory authority, which is effectively a lottery, the Gini coefficient of tasks (0.110) and the longest spell without a task (12.3 days) matched the random benchmark (0.103 and 12.0). Under binding authority both were lower (0.083, p = 0.022; 10.4 days, p = 0.039): holders distributed tasks more evenly than chance would. The effect is probably understated, because in roughly 40 percent of election cycles the office was vacant and allocation reverted to a lottery even in the binding condition. In the earlier pilot, in which offices persisted by default, the same comparison showed far larger equalization (a Gini of 0.026 against 0.086). Authority binding did not alter persistence of control: the longest holder spell and the re-election rate were similar in the two conditions. Binding authority also halved the number of transfers (78 against 167, p = 0.002) and raised the share of promises honored (0.23 against 0.14, p = 0.036).</w:t>
       </w:r>
     </w:p>
     <w:p>
@@ -1976,7 +1976,7 @@
         <w:pStyle w:val="FirstParagraph"/>
       </w:pPr>
       <w:r>
-        <w:t xml:space="preserve">Offices rents raised the count of voters who backed a winner after receiving a gift from that winner (5.1 against 12.9, p &lt; 0.001), which could be taken as evidence of vote buying. The placebo comparison does not support that reading. In the 54 worlds with votes for both a winner and a non-winner, gifted-vote shares were higher for the winner in 30 worlds and for the non-winner in 23, with a mean difference of 0.009. The exchange counts correlate with the volume of transfers in a world (r = 0.59) but not with the number of promises (r = 0.01). Agents who exchange resources freely will often have given something to those who later vote for them, whether or not votes were the object. The count is therefore a poor indicator of an exchange of votes for access, and in our data we cannot distinguish the two.</w:t>
+        <w:t xml:space="preserve">Office rents raised the count of voters who backed a winner after receiving a gift from that winner (5.1 against 12.9, p &lt; 0.001), which could be taken as evidence of vote buying. The placebo comparison does not support that reading. In the 54 worlds with votes for both a winner and a non-winner, gifted-vote shares were higher for the winner in 30 worlds and for the non-winner in 23, with a mean difference of 0.009. The exchange counts correlate with the volume of transfers in a world (r = 0.59) but not with the number of promises (r = 0.01). Agents who exchange resources freely will often have given something to those who later vote for them, whether or not votes were the object. The count is therefore a poor indicator of an exchange of votes for access, and in our data we cannot distinguish the two.</w:t>
       </w:r>
     </w:p>
     <w:bookmarkEnd w:id="37"/>

</xml_diff>

<commit_message>
Update manuscript to 144 main-design worlds
</commit_message>
<xml_diff>
--- a/isr_draft/ISR_manuscript_draft.docx
+++ b/isr_draft/ISR_manuscript_draft.docx
@@ -115,7 +115,7 @@
           <w:iCs/>
           <w:i/>
         </w:rPr>
-        <w:t xml:space="preserve">Working draft. All figures come from 72 main-design worlds (three seeds per cell) and 24 capability-contrast worlds. Numbers will be updated when the additional seeds are complete.</w:t>
+        <w:t xml:space="preserve">Working draft. All figures come from 144 main-design worlds (six seeds per cell) and 24 capability-contrast worlds. Bracketed items are still to be filled from the final event logs.</w:t>
       </w:r>
     </w:p>
     <w:bookmarkStart w:id="20" w:name="abstract"/>
@@ -132,7 +132,7 @@
         <w:pStyle w:val="FirstParagraph"/>
       </w:pPr>
       <w:r>
-        <w:t xml:space="preserve">Organizations are beginning to let networks of large language model (LLM) agents allocate scarce resources among themselves, yet little is known about how the governance rules built into such systems shape who ends up in control. Drawing on IT governance and cumulative-advantage theory, we ask when agents seek and keep allocation authority, and whether holding it concentrates access. We report a controlled simulation of 96 agent worlds in which binding allocation authority, the rewards attached to office, the election rule, and the model composition of the population were varied, and in which every outcome is computed from logged events rather than agent discourse. Office rents sharply increased candidacy and competition, but not inequality of access. Binding authority made allocation more equal than chance. Election rules made no detectable difference. Model family and capability predicted who stood for office. Power concentration was weak; competition for it was not.</w:t>
+        <w:t xml:space="preserve">Organizations are beginning to let networks of large language model (LLM) agents allocate scarce resources among themselves, yet little is known about how the governance rules built into such systems shape who ends up in control. Drawing on IT governance and cumulative-advantage theory, we ask when agents seek and keep allocation authority, and whether holding it concentrates access. We report a controlled simulation of 168 agent worlds in which binding allocation authority, the rewards attached to office, the election rule, and the model composition of the population were varied, and in which every outcome is computed from logged events rather than agent discourse. Office rents sharply increased candidacy and competition, but not inequality of access. Binding authority made allocation more equal than chance. Election rules made no detectable difference. Model family and capability predicted who stood for office. Power concentration was weak; competition for it was not.</w:t>
       </w:r>
     </w:p>
     <w:p>
@@ -192,7 +192,7 @@
         <w:pStyle w:val="BodyText"/>
       </w:pPr>
       <w:r>
-        <w:t xml:space="preserve">Our evidence is a controlled simulation in which four design features were varied across 96 worlds. We report three main findings. First, rewards attached to office determine whether agents compete for it at all; without them most elections drew no candidate. Second, binding allocation authority did not concentrate access. It made allocation more even than a lottery would. Third, which agents took office depended strongly on model family and, within a family, on capability, but mostly through the decision to stand and much less through winning once standing.</w:t>
+        <w:t xml:space="preserve">Our evidence is a controlled simulation in which four design features were varied across 168 worlds. We report three main findings. First, rewards attached to office determine whether agents compete for it at all; without them most elections drew no candidate. Second, binding allocation authority did not concentrate access. It made allocation more even than a lottery would. Third, which agents took office depended strongly on model family and, within a family, on capability, but mostly through the decision to stand and much less through winning once standing.</w:t>
       </w:r>
     </w:p>
     <w:p>
@@ -472,7 +472,7 @@
         <w:pStyle w:val="FirstParagraph"/>
       </w:pPr>
       <w:r>
-        <w:t xml:space="preserve">The main design crosses four factors: authority (binding or advisory), election rule (plurality or ranked-choice), population (all Claude Haiku 5.5; all DeepSeek V4 Pro; or three of each), and office rent (zero or two extra energy per day in office). This gives 24 cells, each run with three seeds, for 72 worlds. A second, capability-contrast design places DeepSeek V4 Flash and V4 Pro agents together in the same world, crossing authority with office rent over six seeds (24 worlds). The within-family contrast separates capability from model family. Models were accessed through OpenRouter at a sampling temperature of 1.0, with hidden reasoning disabled so that responses are direct actions.</w:t>
+        <w:t xml:space="preserve">The main design crosses four factors: authority (binding or advisory), election rule (plurality or ranked-choice), population (all Claude Haiku 5.5; all DeepSeek V4 Pro; or three of each), and office rent (zero or two extra energy per day in office). This gives 24 cells, each run with six seeds, for 144 worlds. A second, capability-contrast design places DeepSeek V4 Flash and V4 Pro agents together in the same world, crossing authority with office rent over six seeds (24 worlds). The within-family contrast separates capability from model family. Models were accessed through OpenRouter at a sampling temperature of 1.0, with hidden reasoning disabled so that responses are direct actions.</w:t>
       </w:r>
     </w:p>
     <w:bookmarkEnd w:id="28"/>
@@ -595,7 +595,7 @@
         <w:pStyle w:val="FirstParagraph"/>
       </w:pPr>
       <w:r>
-        <w:t xml:space="preserve">We compare levels of each factor with two-sided permutation tests (5,000 permutations) using the world as the unit of analysis. The design is balanced, so these marginal comparisons are valid, although they do not adjust for the other factors and so lose power. We ran about thirty-five such tests and applied no multiplicity correction. Results with p-values between 0.02 and 0.05 should be read as exploratory. As a benchmark for inequality, we simulated 2,000 worlds in which two of six agents are drawn at random each day; the expected Gini was 0.103 and the expected longest spell without a task was 12.0 days.</w:t>
+        <w:t xml:space="preserve">We compare levels of each factor with two-sided permutation tests (10,000 permutations) using the world as the unit of analysis. The design is balanced, so these marginal comparisons are valid, although they do not adjust for the other factors and so lose power. We ran about thirty such tests and applied no multiplicity correction. Results with p-values between 0.02 and 0.05 should be read as exploratory. As a benchmark for inequality, we simulated 2,000 worlds in which two of six agents are drawn at random each day; the expected Gini was 0.103 and the expected longest spell without a task was 12.0 days.</w:t>
       </w:r>
     </w:p>
     <w:bookmarkEnd w:id="30"/>
@@ -613,7 +613,7 @@
         <w:pStyle w:val="FirstParagraph"/>
       </w:pPr>
       <w:r>
-        <w:t xml:space="preserve">The design evolved over three stages. An initial 24-world pilot revealed that a task-request step in the advisory condition produced an artifact: agents adopted informal rotation rules, tasks went unfilled, and inequality in that condition reflected lost tasks and not governance. The request step was removed. A second 24-world pilot, run with the corrected design, showed that most elections had no candidate and that incumbents therefore persisted by default. We changed the rule so that an empty election vacates the office, and added the office-rent factor and the placebo gifted-vote measure. The pilots informed the final design and are not pooled with the main results. The design, models, and all analysis code are retained in a repository, and per-call costs are logged.</w:t>
+        <w:t xml:space="preserve">The design evolved over three stages. An initial 24-world pilot revealed that a task-request step in the advisory condition produced an artifact: agents adopted informal rotation rules, tasks went unfilled, and inequality in that condition reflected lost tasks and not governance. The request step was removed. A second 24-world pilot, run with the corrected design, showed that most elections had no candidate and that incumbents therefore persisted by default. We changed the rule so that an empty election vacates the office, and added the office-rent factor and the placebo gifted-vote measure. The pilots informed the final design and are not pooled with the main results. The main design was first run with three seeds per cell; three further seeds were added after an initial look at those results, because several differences were borderline, and all 144 worlds are analyzed together. The stopping decision was therefore not fixed in advance, and readers should treat borderline p-values accordingly. The design, models, and all analysis code are retained in a repository, and per-call costs are logged.</w:t>
       </w:r>
     </w:p>
     <w:bookmarkEnd w:id="31"/>
@@ -641,7 +641,7 @@
         <w:pStyle w:val="FirstParagraph"/>
       </w:pPr>
       <w:r>
-        <w:t xml:space="preserve">Office rents changed the nature of the elections (Table 1). Without rents, 56 percent of elections drew no candidate; with them, 33 percent did. The share of contested elections rose from 25 to 40 percent. Both differences were large relative to chance (p = 0.001). The longest spell of a single holder rose from 8.5 to 13.6 days (p = 0.002). Model family mattered more than any design feature: in Claude-only worlds, 68 percent of elections had no candidate, against 33 percent in DeepSeek-only worlds and 32 percent in mixed worlds.</w:t>
+        <w:t xml:space="preserve">Office rents changed the nature of the elections (Table 1). Without rents, 55 percent of elections drew no candidate; with them, 34 percent did (p &lt; 0.001). The share of contested elections rose from 25 to 40 percent (p &lt; 0.001), and the longest spell of a single holder rose from 8.1 to 12.4 days (p &lt; 0.001). Model family mattered at least as much as any design feature: in Claude-only worlds, 71 percent of elections had no candidate, against 28 percent in DeepSeek-only worlds and 35 percent in mixed worlds.</w:t>
       </w:r>
     </w:p>
     <w:p>
@@ -653,7 +653,7 @@
           <w:bCs/>
           <w:b/>
         </w:rPr>
-        <w:t xml:space="preserve">Table 1. Main effects (72 worlds; means by level)</w:t>
+        <w:t xml:space="preserve">Table 1. Main effects (144 worlds; means by level; two-sided permutation p-values)</w:t>
       </w:r>
     </w:p>
     <w:tbl>
@@ -821,79 +821,31 @@
               <w:jc w:val="left"/>
             </w:pPr>
             <w:r>
-              <w:t xml:space="preserve">0.56</w:t>
-            </w:r>
-          </w:p>
-        </w:tc>
-        <w:tc>
-          <w:tcPr/>
-          <w:p>
-            <w:pPr>
-              <w:pStyle w:val="Compact"/>
-              <w:jc w:val="left"/>
-            </w:pPr>
-            <w:r>
-              <w:t xml:space="preserve">0.33</w:t>
-            </w:r>
-          </w:p>
-        </w:tc>
-        <w:tc>
-          <w:tcPr/>
-          <w:p>
-            <w:pPr>
-              <w:pStyle w:val="Compact"/>
-              <w:jc w:val="left"/>
-            </w:pPr>
-            <w:r>
-              <w:t xml:space="preserve">0.001</w:t>
-            </w:r>
-          </w:p>
-        </w:tc>
-        <w:tc>
-          <w:tcPr/>
-          <w:p>
-            <w:pPr>
-              <w:pStyle w:val="Compact"/>
-              <w:jc w:val="left"/>
-            </w:pPr>
-            <w:r>
-              <w:t xml:space="preserve">0.46</w:t>
-            </w:r>
-          </w:p>
-        </w:tc>
-        <w:tc>
-          <w:tcPr/>
-          <w:p>
-            <w:pPr>
-              <w:pStyle w:val="Compact"/>
-              <w:jc w:val="left"/>
-            </w:pPr>
-            <w:r>
-              <w:t xml:space="preserve">0.42</w:t>
-            </w:r>
-          </w:p>
-        </w:tc>
-        <w:tc>
-          <w:tcPr/>
-          <w:p>
-            <w:pPr>
-              <w:pStyle w:val="Compact"/>
-              <w:jc w:val="left"/>
-            </w:pPr>
-            <w:r>
-              <w:t xml:space="preserve">0.57</w:t>
-            </w:r>
-          </w:p>
-        </w:tc>
-        <w:tc>
-          <w:tcPr/>
-          <w:p>
-            <w:pPr>
-              <w:pStyle w:val="Compact"/>
-              <w:jc w:val="left"/>
-            </w:pPr>
-            <w:r>
-              <w:t xml:space="preserve">0.43</w:t>
+              <w:t xml:space="preserve">0.55</w:t>
+            </w:r>
+          </w:p>
+        </w:tc>
+        <w:tc>
+          <w:tcPr/>
+          <w:p>
+            <w:pPr>
+              <w:pStyle w:val="Compact"/>
+              <w:jc w:val="left"/>
+            </w:pPr>
+            <w:r>
+              <w:t xml:space="preserve">0.34</w:t>
+            </w:r>
+          </w:p>
+        </w:tc>
+        <w:tc>
+          <w:tcPr/>
+          <w:p>
+            <w:pPr>
+              <w:pStyle w:val="Compact"/>
+              <w:jc w:val="left"/>
+            </w:pPr>
+            <w:r>
+              <w:t xml:space="preserve">&lt;0.001</w:t>
             </w:r>
           </w:p>
         </w:tc>
@@ -917,7 +869,55 @@
               <w:jc w:val="left"/>
             </w:pPr>
             <w:r>
-              <w:t xml:space="preserve">0.83</w:t>
+              <w:t xml:space="preserve">0.44</w:t>
+            </w:r>
+          </w:p>
+        </w:tc>
+        <w:tc>
+          <w:tcPr/>
+          <w:p>
+            <w:pPr>
+              <w:pStyle w:val="Compact"/>
+              <w:jc w:val="left"/>
+            </w:pPr>
+            <w:r>
+              <w:t xml:space="preserve">0.79</w:t>
+            </w:r>
+          </w:p>
+        </w:tc>
+        <w:tc>
+          <w:tcPr/>
+          <w:p>
+            <w:pPr>
+              <w:pStyle w:val="Compact"/>
+              <w:jc w:val="left"/>
+            </w:pPr>
+            <w:r>
+              <w:t xml:space="preserve">0.44</w:t>
+            </w:r>
+          </w:p>
+        </w:tc>
+        <w:tc>
+          <w:tcPr/>
+          <w:p>
+            <w:pPr>
+              <w:pStyle w:val="Compact"/>
+              <w:jc w:val="left"/>
+            </w:pPr>
+            <w:r>
+              <w:t xml:space="preserve">0.45</w:t>
+            </w:r>
+          </w:p>
+        </w:tc>
+        <w:tc>
+          <w:tcPr/>
+          <w:p>
+            <w:pPr>
+              <w:pStyle w:val="Compact"/>
+              <w:jc w:val="left"/>
+            </w:pPr>
+            <w:r>
+              <w:t xml:space="preserve">0.69</w:t>
             </w:r>
           </w:p>
         </w:tc>
@@ -967,31 +967,7 @@
               <w:jc w:val="left"/>
             </w:pPr>
             <w:r>
-              <w:t xml:space="preserve">0.001</w:t>
-            </w:r>
-          </w:p>
-        </w:tc>
-        <w:tc>
-          <w:tcPr/>
-          <w:p>
-            <w:pPr>
-              <w:pStyle w:val="Compact"/>
-              <w:jc w:val="left"/>
-            </w:pPr>
-            <w:r>
-              <w:t xml:space="preserve">0.30</w:t>
-            </w:r>
-          </w:p>
-        </w:tc>
-        <w:tc>
-          <w:tcPr/>
-          <w:p>
-            <w:pPr>
-              <w:pStyle w:val="Compact"/>
-              <w:jc w:val="left"/>
-            </w:pPr>
-            <w:r>
-              <w:t xml:space="preserve">0.35</w:t>
+              <w:t xml:space="preserve">&lt;0.001</w:t>
             </w:r>
           </w:p>
         </w:tc>
@@ -1027,19 +1003,43 @@
               <w:jc w:val="left"/>
             </w:pPr>
             <w:r>
-              <w:t xml:space="preserve">0.31</w:t>
-            </w:r>
-          </w:p>
-        </w:tc>
-        <w:tc>
-          <w:tcPr/>
-          <w:p>
-            <w:pPr>
-              <w:pStyle w:val="Compact"/>
-              <w:jc w:val="left"/>
-            </w:pPr>
-            <w:r>
-              <w:t xml:space="preserve">0.78</w:t>
+              <w:t xml:space="preserve">0.91</w:t>
+            </w:r>
+          </w:p>
+        </w:tc>
+        <w:tc>
+          <w:tcPr/>
+          <w:p>
+            <w:pPr>
+              <w:pStyle w:val="Compact"/>
+              <w:jc w:val="left"/>
+            </w:pPr>
+            <w:r>
+              <w:t xml:space="preserve">0.32</w:t>
+            </w:r>
+          </w:p>
+        </w:tc>
+        <w:tc>
+          <w:tcPr/>
+          <w:p>
+            <w:pPr>
+              <w:pStyle w:val="Compact"/>
+              <w:jc w:val="left"/>
+            </w:pPr>
+            <w:r>
+              <w:t xml:space="preserve">0.33</w:t>
+            </w:r>
+          </w:p>
+        </w:tc>
+        <w:tc>
+          <w:tcPr/>
+          <w:p>
+            <w:pPr>
+              <w:pStyle w:val="Compact"/>
+              <w:jc w:val="left"/>
+            </w:pPr>
+            <w:r>
+              <w:t xml:space="preserve">0.79</w:t>
             </w:r>
           </w:p>
         </w:tc>
@@ -1065,103 +1065,103 @@
               <w:jc w:val="left"/>
             </w:pPr>
             <w:r>
-              <w:t xml:space="preserve">8.5</w:t>
-            </w:r>
-          </w:p>
-        </w:tc>
-        <w:tc>
-          <w:tcPr/>
-          <w:p>
-            <w:pPr>
-              <w:pStyle w:val="Compact"/>
-              <w:jc w:val="left"/>
-            </w:pPr>
-            <w:r>
-              <w:t xml:space="preserve">13.6</w:t>
-            </w:r>
-          </w:p>
-        </w:tc>
-        <w:tc>
-          <w:tcPr/>
-          <w:p>
-            <w:pPr>
-              <w:pStyle w:val="Compact"/>
-              <w:jc w:val="left"/>
-            </w:pPr>
-            <w:r>
-              <w:t xml:space="preserve">0.002</w:t>
-            </w:r>
-          </w:p>
-        </w:tc>
-        <w:tc>
-          <w:tcPr/>
-          <w:p>
-            <w:pPr>
-              <w:pStyle w:val="Compact"/>
-              <w:jc w:val="left"/>
-            </w:pPr>
-            <w:r>
-              <w:t xml:space="preserve">11.8</w:t>
-            </w:r>
-          </w:p>
-        </w:tc>
-        <w:tc>
-          <w:tcPr/>
-          <w:p>
-            <w:pPr>
-              <w:pStyle w:val="Compact"/>
-              <w:jc w:val="left"/>
-            </w:pPr>
-            <w:r>
-              <w:t xml:space="preserve">10.3</w:t>
-            </w:r>
-          </w:p>
-        </w:tc>
-        <w:tc>
-          <w:tcPr/>
-          <w:p>
-            <w:pPr>
-              <w:pStyle w:val="Compact"/>
-              <w:jc w:val="left"/>
-            </w:pPr>
-            <w:r>
-              <w:t xml:space="preserve">0.40</w:t>
-            </w:r>
-          </w:p>
-        </w:tc>
-        <w:tc>
-          <w:tcPr/>
-          <w:p>
-            <w:pPr>
-              <w:pStyle w:val="Compact"/>
-              <w:jc w:val="left"/>
-            </w:pPr>
-            <w:r>
-              <w:t xml:space="preserve">10.7</w:t>
-            </w:r>
-          </w:p>
-        </w:tc>
-        <w:tc>
-          <w:tcPr/>
-          <w:p>
-            <w:pPr>
-              <w:pStyle w:val="Compact"/>
-              <w:jc w:val="left"/>
-            </w:pPr>
-            <w:r>
-              <w:t xml:space="preserve">11.4</w:t>
-            </w:r>
-          </w:p>
-        </w:tc>
-        <w:tc>
-          <w:tcPr/>
-          <w:p>
-            <w:pPr>
-              <w:pStyle w:val="Compact"/>
-              <w:jc w:val="left"/>
-            </w:pPr>
-            <w:r>
-              <w:t xml:space="preserve">0.75</w:t>
+              <w:t xml:space="preserve">8.1</w:t>
+            </w:r>
+          </w:p>
+        </w:tc>
+        <w:tc>
+          <w:tcPr/>
+          <w:p>
+            <w:pPr>
+              <w:pStyle w:val="Compact"/>
+              <w:jc w:val="left"/>
+            </w:pPr>
+            <w:r>
+              <w:t xml:space="preserve">12.4</w:t>
+            </w:r>
+          </w:p>
+        </w:tc>
+        <w:tc>
+          <w:tcPr/>
+          <w:p>
+            <w:pPr>
+              <w:pStyle w:val="Compact"/>
+              <w:jc w:val="left"/>
+            </w:pPr>
+            <w:r>
+              <w:t xml:space="preserve">&lt;0.001</w:t>
+            </w:r>
+          </w:p>
+        </w:tc>
+        <w:tc>
+          <w:tcPr/>
+          <w:p>
+            <w:pPr>
+              <w:pStyle w:val="Compact"/>
+              <w:jc w:val="left"/>
+            </w:pPr>
+            <w:r>
+              <w:t xml:space="preserve">10.1</w:t>
+            </w:r>
+          </w:p>
+        </w:tc>
+        <w:tc>
+          <w:tcPr/>
+          <w:p>
+            <w:pPr>
+              <w:pStyle w:val="Compact"/>
+              <w:jc w:val="left"/>
+            </w:pPr>
+            <w:r>
+              <w:t xml:space="preserve">10.4</w:t>
+            </w:r>
+          </w:p>
+        </w:tc>
+        <w:tc>
+          <w:tcPr/>
+          <w:p>
+            <w:pPr>
+              <w:pStyle w:val="Compact"/>
+              <w:jc w:val="left"/>
+            </w:pPr>
+            <w:r>
+              <w:t xml:space="preserve">0.80</w:t>
+            </w:r>
+          </w:p>
+        </w:tc>
+        <w:tc>
+          <w:tcPr/>
+          <w:p>
+            <w:pPr>
+              <w:pStyle w:val="Compact"/>
+              <w:jc w:val="left"/>
+            </w:pPr>
+            <w:r>
+              <w:t xml:space="preserve">9.9</w:t>
+            </w:r>
+          </w:p>
+        </w:tc>
+        <w:tc>
+          <w:tcPr/>
+          <w:p>
+            <w:pPr>
+              <w:pStyle w:val="Compact"/>
+              <w:jc w:val="left"/>
+            </w:pPr>
+            <w:r>
+              <w:t xml:space="preserve">10.6</w:t>
+            </w:r>
+          </w:p>
+        </w:tc>
+        <w:tc>
+          <w:tcPr/>
+          <w:p>
+            <w:pPr>
+              <w:pStyle w:val="Compact"/>
+              <w:jc w:val="left"/>
+            </w:pPr>
+            <w:r>
+              <w:t xml:space="preserve">0.53</w:t>
             </w:r>
           </w:p>
         </w:tc>
@@ -1187,6 +1187,90 @@
               <w:jc w:val="left"/>
             </w:pPr>
             <w:r>
+              <w:t xml:space="preserve">0.33</w:t>
+            </w:r>
+          </w:p>
+        </w:tc>
+        <w:tc>
+          <w:tcPr/>
+          <w:p>
+            <w:pPr>
+              <w:pStyle w:val="Compact"/>
+              <w:jc w:val="left"/>
+            </w:pPr>
+            <w:r>
+              <w:t xml:space="preserve">0.36</w:t>
+            </w:r>
+          </w:p>
+        </w:tc>
+        <w:tc>
+          <w:tcPr/>
+          <w:p>
+            <w:pPr>
+              <w:pStyle w:val="Compact"/>
+              <w:jc w:val="left"/>
+            </w:pPr>
+            <w:r>
+              <w:t xml:space="preserve">0.54</w:t>
+            </w:r>
+          </w:p>
+        </w:tc>
+        <w:tc>
+          <w:tcPr/>
+          <w:p>
+            <w:pPr>
+              <w:pStyle w:val="Compact"/>
+              <w:jc w:val="left"/>
+            </w:pPr>
+            <w:r>
+              <w:t xml:space="preserve">0.30</w:t>
+            </w:r>
+          </w:p>
+        </w:tc>
+        <w:tc>
+          <w:tcPr/>
+          <w:p>
+            <w:pPr>
+              <w:pStyle w:val="Compact"/>
+              <w:jc w:val="left"/>
+            </w:pPr>
+            <w:r>
+              <w:t xml:space="preserve">0.40</w:t>
+            </w:r>
+          </w:p>
+        </w:tc>
+        <w:tc>
+          <w:tcPr/>
+          <w:p>
+            <w:pPr>
+              <w:pStyle w:val="Compact"/>
+              <w:jc w:val="left"/>
+            </w:pPr>
+            <w:r>
+              <w:t xml:space="preserve">0.09</w:t>
+            </w:r>
+          </w:p>
+        </w:tc>
+        <w:tc>
+          <w:tcPr/>
+          <w:p>
+            <w:pPr>
+              <w:pStyle w:val="Compact"/>
+              <w:jc w:val="left"/>
+            </w:pPr>
+            <w:r>
+              <w:t xml:space="preserve">0.32</w:t>
+            </w:r>
+          </w:p>
+        </w:tc>
+        <w:tc>
+          <w:tcPr/>
+          <w:p>
+            <w:pPr>
+              <w:pStyle w:val="Compact"/>
+              <w:jc w:val="left"/>
+            </w:pPr>
+            <w:r>
               <w:t xml:space="preserve">0.38</w:t>
             </w:r>
           </w:p>
@@ -1199,91 +1283,7 @@
               <w:jc w:val="left"/>
             </w:pPr>
             <w:r>
-              <w:t xml:space="preserve">0.39</w:t>
-            </w:r>
-          </w:p>
-        </w:tc>
-        <w:tc>
-          <w:tcPr/>
-          <w:p>
-            <w:pPr>
-              <w:pStyle w:val="Compact"/>
-              <w:jc w:val="left"/>
-            </w:pPr>
-            <w:r>
-              <w:t xml:space="preserve">0.92</w:t>
-            </w:r>
-          </w:p>
-        </w:tc>
-        <w:tc>
-          <w:tcPr/>
-          <w:p>
-            <w:pPr>
-              <w:pStyle w:val="Compact"/>
-              <w:jc w:val="left"/>
-            </w:pPr>
-            <w:r>
-              <w:t xml:space="preserve">0.38</w:t>
-            </w:r>
-          </w:p>
-        </w:tc>
-        <w:tc>
-          <w:tcPr/>
-          <w:p>
-            <w:pPr>
-              <w:pStyle w:val="Compact"/>
-              <w:jc w:val="left"/>
-            </w:pPr>
-            <w:r>
-              <w:t xml:space="preserve">0.39</w:t>
-            </w:r>
-          </w:p>
-        </w:tc>
-        <w:tc>
-          <w:tcPr/>
-          <w:p>
-            <w:pPr>
-              <w:pStyle w:val="Compact"/>
-              <w:jc w:val="left"/>
-            </w:pPr>
-            <w:r>
-              <w:t xml:space="preserve">0.97</w:t>
-            </w:r>
-          </w:p>
-        </w:tc>
-        <w:tc>
-          <w:tcPr/>
-          <w:p>
-            <w:pPr>
-              <w:pStyle w:val="Compact"/>
-              <w:jc w:val="left"/>
-            </w:pPr>
-            <w:r>
-              <w:t xml:space="preserve">0.33</w:t>
-            </w:r>
-          </w:p>
-        </w:tc>
-        <w:tc>
-          <w:tcPr/>
-          <w:p>
-            <w:pPr>
-              <w:pStyle w:val="Compact"/>
-              <w:jc w:val="left"/>
-            </w:pPr>
-            <w:r>
-              <w:t xml:space="preserve">0.44</w:t>
-            </w:r>
-          </w:p>
-        </w:tc>
-        <w:tc>
-          <w:tcPr/>
-          <w:p>
-            <w:pPr>
-              <w:pStyle w:val="Compact"/>
-              <w:jc w:val="left"/>
-            </w:pPr>
-            <w:r>
-              <w:t xml:space="preserve">0.14</w:t>
+              <w:t xml:space="preserve">0.31</w:t>
             </w:r>
           </w:p>
         </w:tc>
@@ -1321,91 +1321,91 @@
               <w:jc w:val="left"/>
             </w:pPr>
             <w:r>
-              <w:t xml:space="preserve">0.101</w:t>
-            </w:r>
-          </w:p>
-        </w:tc>
-        <w:tc>
-          <w:tcPr/>
-          <w:p>
-            <w:pPr>
-              <w:pStyle w:val="Compact"/>
-              <w:jc w:val="left"/>
-            </w:pPr>
-            <w:r>
-              <w:t xml:space="preserve">0.38</w:t>
-            </w:r>
-          </w:p>
-        </w:tc>
-        <w:tc>
-          <w:tcPr/>
-          <w:p>
-            <w:pPr>
-              <w:pStyle w:val="Compact"/>
-              <w:jc w:val="left"/>
-            </w:pPr>
-            <w:r>
-              <w:t xml:space="preserve">0.110</w:t>
-            </w:r>
-          </w:p>
-        </w:tc>
-        <w:tc>
-          <w:tcPr/>
-          <w:p>
-            <w:pPr>
-              <w:pStyle w:val="Compact"/>
-              <w:jc w:val="left"/>
-            </w:pPr>
-            <w:r>
-              <w:t xml:space="preserve">0.083</w:t>
-            </w:r>
-          </w:p>
-        </w:tc>
-        <w:tc>
-          <w:tcPr/>
-          <w:p>
-            <w:pPr>
-              <w:pStyle w:val="Compact"/>
-              <w:jc w:val="left"/>
-            </w:pPr>
-            <w:r>
-              <w:t xml:space="preserve">0.022</w:t>
-            </w:r>
-          </w:p>
-        </w:tc>
-        <w:tc>
-          <w:tcPr/>
-          <w:p>
-            <w:pPr>
-              <w:pStyle w:val="Compact"/>
-              <w:jc w:val="left"/>
-            </w:pPr>
-            <w:r>
-              <w:t xml:space="preserve">0.093</w:t>
-            </w:r>
-          </w:p>
-        </w:tc>
-        <w:tc>
-          <w:tcPr/>
-          <w:p>
-            <w:pPr>
-              <w:pStyle w:val="Compact"/>
-              <w:jc w:val="left"/>
-            </w:pPr>
-            <w:r>
-              <w:t xml:space="preserve">0.099</w:t>
-            </w:r>
-          </w:p>
-        </w:tc>
-        <w:tc>
-          <w:tcPr/>
-          <w:p>
-            <w:pPr>
-              <w:pStyle w:val="Compact"/>
-              <w:jc w:val="left"/>
-            </w:pPr>
-            <w:r>
-              <w:t xml:space="preserve">0.63</w:t>
+              <w:t xml:space="preserve">0.098</w:t>
+            </w:r>
+          </w:p>
+        </w:tc>
+        <w:tc>
+          <w:tcPr/>
+          <w:p>
+            <w:pPr>
+              <w:pStyle w:val="Compact"/>
+              <w:jc w:val="left"/>
+            </w:pPr>
+            <w:r>
+              <w:t xml:space="preserve">0.34</w:t>
+            </w:r>
+          </w:p>
+        </w:tc>
+        <w:tc>
+          <w:tcPr/>
+          <w:p>
+            <w:pPr>
+              <w:pStyle w:val="Compact"/>
+              <w:jc w:val="left"/>
+            </w:pPr>
+            <w:r>
+              <w:t xml:space="preserve">0.108</w:t>
+            </w:r>
+          </w:p>
+        </w:tc>
+        <w:tc>
+          <w:tcPr/>
+          <w:p>
+            <w:pPr>
+              <w:pStyle w:val="Compact"/>
+              <w:jc w:val="left"/>
+            </w:pPr>
+            <w:r>
+              <w:t xml:space="preserve">0.082</w:t>
+            </w:r>
+          </w:p>
+        </w:tc>
+        <w:tc>
+          <w:tcPr/>
+          <w:p>
+            <w:pPr>
+              <w:pStyle w:val="Compact"/>
+              <w:jc w:val="left"/>
+            </w:pPr>
+            <w:r>
+              <w:t xml:space="preserve">&lt;0.001</w:t>
+            </w:r>
+          </w:p>
+        </w:tc>
+        <w:tc>
+          <w:tcPr/>
+          <w:p>
+            <w:pPr>
+              <w:pStyle w:val="Compact"/>
+              <w:jc w:val="left"/>
+            </w:pPr>
+            <w:r>
+              <w:t xml:space="preserve">0.094</w:t>
+            </w:r>
+          </w:p>
+        </w:tc>
+        <w:tc>
+          <w:tcPr/>
+          <w:p>
+            <w:pPr>
+              <w:pStyle w:val="Compact"/>
+              <w:jc w:val="left"/>
+            </w:pPr>
+            <w:r>
+              <w:t xml:space="preserve">0.096</w:t>
+            </w:r>
+          </w:p>
+        </w:tc>
+        <w:tc>
+          <w:tcPr/>
+          <w:p>
+            <w:pPr>
+              <w:pStyle w:val="Compact"/>
+              <w:jc w:val="left"/>
+            </w:pPr>
+            <w:r>
+              <w:t xml:space="preserve">0.77</w:t>
             </w:r>
           </w:p>
         </w:tc>
@@ -1431,31 +1431,7 @@
               <w:jc w:val="left"/>
             </w:pPr>
             <w:r>
-              <w:t xml:space="preserve">10.7</w:t>
-            </w:r>
-          </w:p>
-        </w:tc>
-        <w:tc>
-          <w:tcPr/>
-          <w:p>
-            <w:pPr>
-              <w:pStyle w:val="Compact"/>
-              <w:jc w:val="left"/>
-            </w:pPr>
-            <w:r>
-              <w:t xml:space="preserve">11.9</w:t>
-            </w:r>
-          </w:p>
-        </w:tc>
-        <w:tc>
-          <w:tcPr/>
-          <w:p>
-            <w:pPr>
-              <w:pStyle w:val="Compact"/>
-              <w:jc w:val="left"/>
-            </w:pPr>
-            <w:r>
-              <w:t xml:space="preserve">0.16</w:t>
+              <w:t xml:space="preserve">11.0</w:t>
             </w:r>
           </w:p>
         </w:tc>
@@ -1479,19 +1455,19 @@
               <w:jc w:val="left"/>
             </w:pPr>
             <w:r>
-              <w:t xml:space="preserve">10.4</w:t>
-            </w:r>
-          </w:p>
-        </w:tc>
-        <w:tc>
-          <w:tcPr/>
-          <w:p>
-            <w:pPr>
-              <w:pStyle w:val="Compact"/>
-              <w:jc w:val="left"/>
-            </w:pPr>
-            <w:r>
-              <w:t xml:space="preserve">0.039</w:t>
+              <w:t xml:space="preserve">0.07</w:t>
+            </w:r>
+          </w:p>
+        </w:tc>
+        <w:tc>
+          <w:tcPr/>
+          <w:p>
+            <w:pPr>
+              <w:pStyle w:val="Compact"/>
+              <w:jc w:val="left"/>
+            </w:pPr>
+            <w:r>
+              <w:t xml:space="preserve">12.0</w:t>
             </w:r>
           </w:p>
         </w:tc>
@@ -1515,19 +1491,43 @@
               <w:jc w:val="left"/>
             </w:pPr>
             <w:r>
-              <w:t xml:space="preserve">11.4</w:t>
-            </w:r>
-          </w:p>
-        </w:tc>
-        <w:tc>
-          <w:tcPr/>
-          <w:p>
-            <w:pPr>
-              <w:pStyle w:val="Compact"/>
-              <w:jc w:val="left"/>
-            </w:pPr>
-            <w:r>
-              <w:t xml:space="preserve">0.79</w:t>
+              <w:t xml:space="preserve">0.28</w:t>
+            </w:r>
+          </w:p>
+        </w:tc>
+        <w:tc>
+          <w:tcPr/>
+          <w:p>
+            <w:pPr>
+              <w:pStyle w:val="Compact"/>
+              <w:jc w:val="left"/>
+            </w:pPr>
+            <w:r>
+              <w:t xml:space="preserve">11.6</w:t>
+            </w:r>
+          </w:p>
+        </w:tc>
+        <w:tc>
+          <w:tcPr/>
+          <w:p>
+            <w:pPr>
+              <w:pStyle w:val="Compact"/>
+              <w:jc w:val="left"/>
+            </w:pPr>
+            <w:r>
+              <w:t xml:space="preserve">11.7</w:t>
+            </w:r>
+          </w:p>
+        </w:tc>
+        <w:tc>
+          <w:tcPr/>
+          <w:p>
+            <w:pPr>
+              <w:pStyle w:val="Compact"/>
+              <w:jc w:val="left"/>
+            </w:pPr>
+            <w:r>
+              <w:t xml:space="preserve">0.87</w:t>
             </w:r>
           </w:p>
         </w:tc>
@@ -1553,19 +1553,19 @@
               <w:jc w:val="left"/>
             </w:pPr>
             <w:r>
-              <w:t xml:space="preserve">5.1</w:t>
-            </w:r>
-          </w:p>
-        </w:tc>
-        <w:tc>
-          <w:tcPr/>
-          <w:p>
-            <w:pPr>
-              <w:pStyle w:val="Compact"/>
-              <w:jc w:val="left"/>
-            </w:pPr>
-            <w:r>
-              <w:t xml:space="preserve">12.9</w:t>
+              <w:t xml:space="preserve">5.8</w:t>
+            </w:r>
+          </w:p>
+        </w:tc>
+        <w:tc>
+          <w:tcPr/>
+          <w:p>
+            <w:pPr>
+              <w:pStyle w:val="Compact"/>
+              <w:jc w:val="left"/>
+            </w:pPr>
+            <w:r>
+              <w:t xml:space="preserve">11.5</w:t>
             </w:r>
           </w:p>
         </w:tc>
@@ -1589,67 +1589,67 @@
               <w:jc w:val="left"/>
             </w:pPr>
             <w:r>
-              <w:t xml:space="preserve">9.9</w:t>
-            </w:r>
-          </w:p>
-        </w:tc>
-        <w:tc>
-          <w:tcPr/>
-          <w:p>
-            <w:pPr>
-              <w:pStyle w:val="Compact"/>
-              <w:jc w:val="left"/>
-            </w:pPr>
-            <w:r>
-              <w:t xml:space="preserve">8.1</w:t>
-            </w:r>
-          </w:p>
-        </w:tc>
-        <w:tc>
-          <w:tcPr/>
-          <w:p>
-            <w:pPr>
-              <w:pStyle w:val="Compact"/>
-              <w:jc w:val="left"/>
-            </w:pPr>
-            <w:r>
-              <w:t xml:space="preserve">0.37</w:t>
-            </w:r>
-          </w:p>
-        </w:tc>
-        <w:tc>
-          <w:tcPr/>
-          <w:p>
-            <w:pPr>
-              <w:pStyle w:val="Compact"/>
-              <w:jc w:val="left"/>
-            </w:pPr>
-            <w:r>
-              <w:t xml:space="preserve">8.8</w:t>
-            </w:r>
-          </w:p>
-        </w:tc>
-        <w:tc>
-          <w:tcPr/>
-          <w:p>
-            <w:pPr>
-              <w:pStyle w:val="Compact"/>
-              <w:jc w:val="left"/>
-            </w:pPr>
-            <w:r>
-              <w:t xml:space="preserve">9.2</w:t>
-            </w:r>
-          </w:p>
-        </w:tc>
-        <w:tc>
-          <w:tcPr/>
-          <w:p>
-            <w:pPr>
-              <w:pStyle w:val="Compact"/>
-              <w:jc w:val="left"/>
-            </w:pPr>
-            <w:r>
-              <w:t xml:space="preserve">0.84</w:t>
+              <w:t xml:space="preserve">9.7</w:t>
+            </w:r>
+          </w:p>
+        </w:tc>
+        <w:tc>
+          <w:tcPr/>
+          <w:p>
+            <w:pPr>
+              <w:pStyle w:val="Compact"/>
+              <w:jc w:val="left"/>
+            </w:pPr>
+            <w:r>
+              <w:t xml:space="preserve">7.6</w:t>
+            </w:r>
+          </w:p>
+        </w:tc>
+        <w:tc>
+          <w:tcPr/>
+          <w:p>
+            <w:pPr>
+              <w:pStyle w:val="Compact"/>
+              <w:jc w:val="left"/>
+            </w:pPr>
+            <w:r>
+              <w:t xml:space="preserve">0.13</w:t>
+            </w:r>
+          </w:p>
+        </w:tc>
+        <w:tc>
+          <w:tcPr/>
+          <w:p>
+            <w:pPr>
+              <w:pStyle w:val="Compact"/>
+              <w:jc w:val="left"/>
+            </w:pPr>
+            <w:r>
+              <w:t xml:space="preserve">8.9</w:t>
+            </w:r>
+          </w:p>
+        </w:tc>
+        <w:tc>
+          <w:tcPr/>
+          <w:p>
+            <w:pPr>
+              <w:pStyle w:val="Compact"/>
+              <w:jc w:val="left"/>
+            </w:pPr>
+            <w:r>
+              <w:t xml:space="preserve">8.4</w:t>
+            </w:r>
+          </w:p>
+        </w:tc>
+        <w:tc>
+          <w:tcPr/>
+          <w:p>
+            <w:pPr>
+              <w:pStyle w:val="Compact"/>
+              <w:jc w:val="left"/>
+            </w:pPr>
+            <w:r>
+              <w:t xml:space="preserve">0.72</w:t>
             </w:r>
           </w:p>
         </w:tc>
@@ -1675,79 +1675,7 @@
               <w:jc w:val="left"/>
             </w:pPr>
             <w:r>
-              <w:t xml:space="preserve">106</w:t>
-            </w:r>
-          </w:p>
-        </w:tc>
-        <w:tc>
-          <w:tcPr/>
-          <w:p>
-            <w:pPr>
-              <w:pStyle w:val="Compact"/>
-              <w:jc w:val="left"/>
-            </w:pPr>
-            <w:r>
-              <w:t xml:space="preserve">140</w:t>
-            </w:r>
-          </w:p>
-        </w:tc>
-        <w:tc>
-          <w:tcPr/>
-          <w:p>
-            <w:pPr>
-              <w:pStyle w:val="Compact"/>
-              <w:jc w:val="left"/>
-            </w:pPr>
-            <w:r>
-              <w:t xml:space="preserve">0.26</w:t>
-            </w:r>
-          </w:p>
-        </w:tc>
-        <w:tc>
-          <w:tcPr/>
-          <w:p>
-            <w:pPr>
-              <w:pStyle w:val="Compact"/>
-              <w:jc w:val="left"/>
-            </w:pPr>
-            <w:r>
-              <w:t xml:space="preserve">167</w:t>
-            </w:r>
-          </w:p>
-        </w:tc>
-        <w:tc>
-          <w:tcPr/>
-          <w:p>
-            <w:pPr>
-              <w:pStyle w:val="Compact"/>
-              <w:jc w:val="left"/>
-            </w:pPr>
-            <w:r>
-              <w:t xml:space="preserve">78</w:t>
-            </w:r>
-          </w:p>
-        </w:tc>
-        <w:tc>
-          <w:tcPr/>
-          <w:p>
-            <w:pPr>
-              <w:pStyle w:val="Compact"/>
-              <w:jc w:val="left"/>
-            </w:pPr>
-            <w:r>
-              <w:t xml:space="preserve">0.002</w:t>
-            </w:r>
-          </w:p>
-        </w:tc>
-        <w:tc>
-          <w:tcPr/>
-          <w:p>
-            <w:pPr>
-              <w:pStyle w:val="Compact"/>
-              <w:jc w:val="left"/>
-            </w:pPr>
-            <w:r>
-              <w:t xml:space="preserve">124</w:t>
+              <w:t xml:space="preserve">100</w:t>
             </w:r>
           </w:p>
         </w:tc>
@@ -1771,7 +1699,79 @@
               <w:jc w:val="left"/>
             </w:pPr>
             <w:r>
-              <w:t xml:space="preserve">0.95</w:t>
+              <w:t xml:space="preserve">0.27</w:t>
+            </w:r>
+          </w:p>
+        </w:tc>
+        <w:tc>
+          <w:tcPr/>
+          <w:p>
+            <w:pPr>
+              <w:pStyle w:val="Compact"/>
+              <w:jc w:val="left"/>
+            </w:pPr>
+            <w:r>
+              <w:t xml:space="preserve">153</w:t>
+            </w:r>
+          </w:p>
+        </w:tc>
+        <w:tc>
+          <w:tcPr/>
+          <w:p>
+            <w:pPr>
+              <w:pStyle w:val="Compact"/>
+              <w:jc w:val="left"/>
+            </w:pPr>
+            <w:r>
+              <w:t xml:space="preserve">68</w:t>
+            </w:r>
+          </w:p>
+        </w:tc>
+        <w:tc>
+          <w:tcPr/>
+          <w:p>
+            <w:pPr>
+              <w:pStyle w:val="Compact"/>
+              <w:jc w:val="left"/>
+            </w:pPr>
+            <w:r>
+              <w:t xml:space="preserve">&lt;0.001</w:t>
+            </w:r>
+          </w:p>
+        </w:tc>
+        <w:tc>
+          <w:tcPr/>
+          <w:p>
+            <w:pPr>
+              <w:pStyle w:val="Compact"/>
+              <w:jc w:val="left"/>
+            </w:pPr>
+            <w:r>
+              <w:t xml:space="preserve">117</w:t>
+            </w:r>
+          </w:p>
+        </w:tc>
+        <w:tc>
+          <w:tcPr/>
+          <w:p>
+            <w:pPr>
+              <w:pStyle w:val="Compact"/>
+              <w:jc w:val="left"/>
+            </w:pPr>
+            <w:r>
+              <w:t xml:space="preserve">104</w:t>
+            </w:r>
+          </w:p>
+        </w:tc>
+        <w:tc>
+          <w:tcPr/>
+          <w:p>
+            <w:pPr>
+              <w:pStyle w:val="Compact"/>
+              <w:jc w:val="left"/>
+            </w:pPr>
+            <w:r>
+              <w:t xml:space="preserve">0.54</w:t>
             </w:r>
           </w:p>
         </w:tc>
@@ -1797,79 +1797,7 @@
               <w:jc w:val="left"/>
             </w:pPr>
             <w:r>
-              <w:t xml:space="preserve">0.14</w:t>
-            </w:r>
-          </w:p>
-        </w:tc>
-        <w:tc>
-          <w:tcPr/>
-          <w:p>
-            <w:pPr>
-              <w:pStyle w:val="Compact"/>
-              <w:jc w:val="left"/>
-            </w:pPr>
-            <w:r>
-              <w:t xml:space="preserve">0.22</w:t>
-            </w:r>
-          </w:p>
-        </w:tc>
-        <w:tc>
-          <w:tcPr/>
-          <w:p>
-            <w:pPr>
-              <w:pStyle w:val="Compact"/>
-              <w:jc w:val="left"/>
-            </w:pPr>
-            <w:r>
-              <w:t xml:space="preserve">0.07</w:t>
-            </w:r>
-          </w:p>
-        </w:tc>
-        <w:tc>
-          <w:tcPr/>
-          <w:p>
-            <w:pPr>
-              <w:pStyle w:val="Compact"/>
-              <w:jc w:val="left"/>
-            </w:pPr>
-            <w:r>
-              <w:t xml:space="preserve">0.14</w:t>
-            </w:r>
-          </w:p>
-        </w:tc>
-        <w:tc>
-          <w:tcPr/>
-          <w:p>
-            <w:pPr>
-              <w:pStyle w:val="Compact"/>
-              <w:jc w:val="left"/>
-            </w:pPr>
-            <w:r>
-              <w:t xml:space="preserve">0.23</w:t>
-            </w:r>
-          </w:p>
-        </w:tc>
-        <w:tc>
-          <w:tcPr/>
-          <w:p>
-            <w:pPr>
-              <w:pStyle w:val="Compact"/>
-              <w:jc w:val="left"/>
-            </w:pPr>
-            <w:r>
-              <w:t xml:space="preserve">0.036</w:t>
-            </w:r>
-          </w:p>
-        </w:tc>
-        <w:tc>
-          <w:tcPr/>
-          <w:p>
-            <w:pPr>
-              <w:pStyle w:val="Compact"/>
-              <w:jc w:val="left"/>
-            </w:pPr>
-            <w:r>
-              <w:t xml:space="preserve">0.18</w:t>
+              <w:t xml:space="preserve">0.12</w:t>
             </w:r>
           </w:p>
         </w:tc>
@@ -1893,7 +1821,79 @@
               <w:jc w:val="left"/>
             </w:pPr>
             <w:r>
-              <w:t xml:space="preserve">0.84</w:t>
+              <w:t xml:space="preserve">0.008</w:t>
+            </w:r>
+          </w:p>
+        </w:tc>
+        <w:tc>
+          <w:tcPr/>
+          <w:p>
+            <w:pPr>
+              <w:pStyle w:val="Compact"/>
+              <w:jc w:val="left"/>
+            </w:pPr>
+            <w:r>
+              <w:t xml:space="preserve">0.12</w:t>
+            </w:r>
+          </w:p>
+        </w:tc>
+        <w:tc>
+          <w:tcPr/>
+          <w:p>
+            <w:pPr>
+              <w:pStyle w:val="Compact"/>
+              <w:jc w:val="left"/>
+            </w:pPr>
+            <w:r>
+              <w:t xml:space="preserve">0.20</w:t>
+            </w:r>
+          </w:p>
+        </w:tc>
+        <w:tc>
+          <w:tcPr/>
+          <w:p>
+            <w:pPr>
+              <w:pStyle w:val="Compact"/>
+              <w:jc w:val="left"/>
+            </w:pPr>
+            <w:r>
+              <w:t xml:space="preserve">0.002</w:t>
+            </w:r>
+          </w:p>
+        </w:tc>
+        <w:tc>
+          <w:tcPr/>
+          <w:p>
+            <w:pPr>
+              <w:pStyle w:val="Compact"/>
+              <w:jc w:val="left"/>
+            </w:pPr>
+            <w:r>
+              <w:t xml:space="preserve">0.16</w:t>
+            </w:r>
+          </w:p>
+        </w:tc>
+        <w:tc>
+          <w:tcPr/>
+          <w:p>
+            <w:pPr>
+              <w:pStyle w:val="Compact"/>
+              <w:jc w:val="left"/>
+            </w:pPr>
+            <w:r>
+              <w:t xml:space="preserve">0.16</w:t>
+            </w:r>
+          </w:p>
+        </w:tc>
+        <w:tc>
+          <w:tcPr/>
+          <w:p>
+            <w:pPr>
+              <w:pStyle w:val="Compact"/>
+              <w:jc w:val="left"/>
+            </w:pPr>
+            <w:r>
+              <w:t xml:space="preserve">0.81</w:t>
             </w:r>
           </w:p>
         </w:tc>
@@ -1914,7 +1914,7 @@
         <w:pStyle w:val="FirstParagraph"/>
       </w:pPr>
       <w:r>
-        <w:t xml:space="preserve">Binding authority did not concentrate access. Under advisory authority, which is effectively a lottery, the Gini coefficient of tasks (0.110) and the longest spell without a task (12.3 days) matched the random benchmark (0.103 and 12.0). Under binding authority both were lower (0.083, p = 0.022; 10.4 days, p = 0.039): holders distributed tasks more evenly than chance would. The effect is probably understated, because in roughly 40 percent of election cycles the office was vacant and allocation reverted to a lottery even in the binding condition. In the earlier pilot, in which offices persisted by default, the same comparison showed far larger equalization (a Gini of 0.026 against 0.086). Authority binding did not alter persistence of control: the longest holder spell and the re-election rate were similar in the two conditions. Binding authority also halved the number of transfers (78 against 167, p = 0.002) and raised the share of promises honored (0.23 against 0.14, p = 0.036).</w:t>
+        <w:t xml:space="preserve">Binding authority did not concentrate access. Under advisory authority, which is effectively a lottery, the Gini coefficient of tasks (0.108) and the longest spell without a task (12.0 days) matched the random benchmark (0.103 and 12.0). Under binding authority the Gini was lower (0.082, p &lt; 0.001): holders distributed tasks more evenly than chance would. The longest spell without a task was also shorter (11.2 days) but this difference is not distinguishable from noise (p = 0.28). The effect on the Gini is probably understated, because in roughly 45 percent of election cycles the office was vacant and allocation reverted to a lottery even in the binding condition. In the earlier pilot, in which offices persisted by default, the same comparison showed far larger equalization (a Gini of 0.026 against 0.086). Authority binding did not alter the persistence of control: the longest holder spell was 10.1 days under advisory and 10.4 under binding authority, and the re-election rate rose from 0.30 to 0.40 (p = 0.09), a small difference that we do not interpret. Binding authority also halved the number of transfers (68 against 153, p &lt; 0.001), reduced the number of access promises (43 against 64, p = 0.009), and raised the share of promises honored (0.20 against 0.12, p = 0.002).</w:t>
       </w:r>
     </w:p>
     <w:p>
@@ -1922,7 +1922,7 @@
         <w:pStyle w:val="BodyText"/>
       </w:pPr>
       <w:r>
-        <w:t xml:space="preserve">The proposed interaction between authority and rents (P3) was not supported. Rents did not change the Gini of tasks (0.091 against 0.101, p = 0.38) or the longest spell without a task (10.7 against 11.9 days, p = 0.16), and the equalizing effect of binding authority was similar at both levels of rent.</w:t>
+        <w:t xml:space="preserve">The proposed interaction between authority and rents (P3) received only weak support. For the Gini of tasks the interaction was negligible (difference in differences of 0.008; permutation p = 0.60). For the longest spell without a task, binding authority shortened exclusion by about two days when office carried no rents (9.9 against 12.0 days) but not at all when it did (12.5 against 12.0 days). The difference in differences is 2.6 days (permutation p = 0.055, bootstrap interval from −0.1 to 5.3). We read this as suggestive and not as established.</w:t>
       </w:r>
     </w:p>
     <w:bookmarkEnd w:id="34"/>
@@ -1940,7 +1940,7 @@
         <w:pStyle w:val="FirstParagraph"/>
       </w:pPr>
       <w:r>
-        <w:t xml:space="preserve">Plurality and ranked-choice produced indistinguishable outcomes on every measure we examined (all p &gt; 0.14; Table 1). The largest gap was in re-election (0.33 under plurality, 0.44 under ranked-choice), in the direction opposite to P4, and it is not distinguishable from noise at this sample size.</w:t>
+        <w:t xml:space="preserve">Plurality and ranked-choice produced indistinguishable outcomes on every measure we examined (all p ≥ 0.22; Table 1). The largest gap was in re-election (0.32 under plurality, 0.38 under ranked-choice), in the direction opposite to P4, and it is not distinguishable from noise at this sample size.</w:t>
       </w:r>
     </w:p>
     <w:bookmarkEnd w:id="35"/>
@@ -1958,7 +1958,7 @@
         <w:pStyle w:val="FirstParagraph"/>
       </w:pPr>
       <w:r>
-        <w:t xml:space="preserve">Model composition shaped which agents stood and which won. In the mixed Claude/DeepSeek worlds, agents powered by Claude stood in 64 elections and won 27, while DeepSeek agents stood 245 times and won 137. DeepSeek therefore held 84 percent of the terms filled, in line with its 79 percent share of candidacies. In the capability contrast, the stronger DeepSeek V4 Pro stood 246 times and won 121; the weaker V4 Flash stood 161 times and won 56. Given who stood in each election, a random draw among the candidates would have given Pro about 112 victories, against 121 observed [test statistic to be added]. Most of Pro’s advantage is therefore accounted for by its greater willingness to stand, and the extra success once standing is modest. P5 is supported as regards selection into candidacy, but our data cannot show that capability confers an advantage in winning.</w:t>
+        <w:t xml:space="preserve">Model composition shaped which agents stood and which won. In the mixed Claude/DeepSeek worlds, agents powered by Claude stood in [x] elections and won [x], while DeepSeek agents stood [x] times and won [x] [to be filled from the 48 mixed worlds]. In the first 24 mixed worlds, DeepSeek held 84 percent of the terms filled, in line with its 79 percent share of candidacies. In the capability contrast, the stronger DeepSeek V4 Pro stood 246 times and won 121; the weaker V4 Flash stood 161 times and won 56. Given who stood in each election, a random draw among the candidates would have given Pro about 112 victories, against 121 observed [test statistic to be added]. Most of Pro’s advantage is therefore accounted for by its greater willingness to stand, and the extra success once standing is modest. P5 is supported as regards selection into candidacy, but our data cannot show that capability confers an advantage in winning.</w:t>
       </w:r>
     </w:p>
     <w:bookmarkEnd w:id="36"/>
@@ -1976,7 +1976,7 @@
         <w:pStyle w:val="FirstParagraph"/>
       </w:pPr>
       <w:r>
-        <w:t xml:space="preserve">Office rents raised the count of voters who backed a winner after receiving a gift from that winner (5.1 against 12.9, p &lt; 0.001), which could be taken as evidence of vote buying. The placebo comparison does not support that reading. In the 54 worlds with votes for both a winner and a non-winner, gifted-vote shares were higher for the winner in 30 worlds and for the non-winner in 23, with a mean difference of 0.009. The exchange counts correlate with the volume of transfers in a world (r = 0.59) but not with the number of promises (r = 0.01). Agents who exchange resources freely will often have given something to those who later vote for them, whether or not votes were the object. The count is therefore a poor indicator of an exchange of votes for access, and in our data we cannot distinguish the two.</w:t>
+        <w:t xml:space="preserve">Office rents raised the count of voters who backed a winner after receiving a gift from that winner (5.8 against 11.5, p &lt; 0.001), which could be taken as evidence of vote buying. The placebo comparison does not support that reading. In the 110 worlds with votes for both a winner and a non-winner, gifted-vote shares were higher for the winner in 58 worlds and for the non-winner in 50 (two ties), with a mean difference of −0.013. The exchange counts correlate with the volume of transfers in a world (r = 0.67) but not with the number of promises (r = −0.07). Agents who exchange resources freely will often have given something to those who later vote for them, whether or not votes were the object. The count is therefore a poor indicator of an exchange of votes for access, and in our data we cannot distinguish the two.</w:t>
       </w:r>
     </w:p>
     <w:bookmarkEnd w:id="37"/>
@@ -2004,7 +2004,7 @@
         <w:pStyle w:val="FirstParagraph"/>
       </w:pPr>
       <w:r>
-        <w:t xml:space="preserve">The data do not support the expectation that scarce resources and allocation authority lead LLM agents to capture access. Where authority was binding, access was more equal than chance. The pattern of competition was driven by the rewards attached to office: when office was worth nothing, most agents did not stand, and when it paid, competition and the volume of exchange rose, but inequality of access did not. For designers, the result locates the lever. The rents attached to a position, and not the authority attached to it, determine whether it becomes contested. Whether contest turns into capture is a separate question that, in this environment, the agents answered mostly in the negative.</w:t>
+        <w:t xml:space="preserve">The data do not support the expectation that scarce resources and allocation authority lead LLM agents to capture access. Where authority was binding, the distribution of tasks was more equal than chance. The pattern of competition was driven by the rewards attached to office: when office was worth nothing, most agents did not stand, and when it paid, competition and the volume of exchange rose, but inequality of access did not. For designers, the result locates the lever. The rents attached to a position, and not the authority attached to it, determine whether it becomes contested. Whether contest turns into capture is a separate question that, in this environment, the agents answered mostly in the negative.</w:t>
       </w:r>
     </w:p>
     <w:p>
@@ -2012,7 +2012,7 @@
         <w:pStyle w:val="BodyText"/>
       </w:pPr>
       <w:r>
-        <w:t xml:space="preserve">The observation that agents often held office for stretches of ten days or more is easily over-read. A considerable part of that persistence in the pilot reflected incumbents continuing by default when nobody stood. After correcting for this, the longest holder spells (8.5 to 13.6 days, against terms of five days) correspond to two or three consecutive terms, which is moderate.</w:t>
+        <w:t xml:space="preserve">The observation that agents often held office for stretches of ten days or more is easily over-read. A considerable part of that persistence in the pilot reflected incumbents continuing by default when nobody stood. After correcting for this, the longest holder spells (8.1 to 12.4 days, against terms of five days) correspond to two or three consecutive terms, which is moderate.</w:t>
       </w:r>
     </w:p>
     <w:bookmarkEnd w:id="39"/>
@@ -2085,7 +2085,7 @@
         <w:pStyle w:val="FirstParagraph"/>
       </w:pPr>
       <w:r>
-        <w:t xml:space="preserve">We asked when LLM agents sharing scarce resources seek and keep control over allocation, and whether control becomes capture. In a controlled simulation of 96 worlds, the rewards attached to office determined whether agents competed for it, binding authority led to more equal allocation than chance, election rules made no detectable difference, and stronger models were more active in seeking office. Where concentration appeared, it was concentration of office, not of access. For the designers of agentic systems, the primary design lever is the value attached to a role, and the evidence for capture by authority is, so far, weak.</w:t>
+        <w:t xml:space="preserve">We asked when LLM agents sharing scarce resources seek and keep control over allocation, and whether control becomes capture. In a controlled simulation of 168 worlds, the rewards attached to office determined whether agents competed for it, binding authority led to a more equal distribution of tasks than chance, election rules made no detectable difference, and stronger models were more active in seeking office. Where concentration appeared, it was concentration of office, not of access. For the designers of agentic systems, the primary design lever is the value attached to a role, and the evidence for capture by authority is, so far, weak.</w:t>
       </w:r>
     </w:p>
     <w:bookmarkEnd w:id="44"/>

</xml_diff>

<commit_message>
Fill mixed-world and capability-contrast results in manuscript
Co-Authored-By: Claude Sonnet 5.5 <noreply@anthropic.com>
Claude-Session: https://claude.ai/code/session_01Hv17up5m6zhCqJ5SAWN1gB
</commit_message>
<xml_diff>
--- a/isr_draft/ISR_manuscript_draft.docx
+++ b/isr_draft/ISR_manuscript_draft.docx
@@ -1958,7 +1958,15 @@
         <w:pStyle w:val="FirstParagraph"/>
       </w:pPr>
       <w:r>
-        <w:t xml:space="preserve">Model composition shaped which agents stood and which won. In the mixed Claude/DeepSeek worlds, agents powered by Claude stood in [x] elections and won [x], while DeepSeek agents stood [x] times and won [x] [to be filled from the 48 mixed worlds]. In the first 24 mixed worlds, DeepSeek held 84 percent of the terms filled, in line with its 79 percent share of candidacies. In the capability contrast, the stronger DeepSeek V4 Pro stood 246 times and won 121; the weaker V4 Flash stood 161 times and won 56. Given who stood in each election, a random draw among the candidates would have given Pro about 112 victories, against 121 observed [test statistic to be added]. Most of Pro’s advantage is therefore accounted for by its greater willingness to stand, and the extra success once standing is modest. P5 is supported as regards selection into candidacy, but our data cannot show that capability confers an advantage in winning.</w:t>
+        <w:t xml:space="preserve">Model composition shaped which agents stood and which won. In the 48 mixed Claude/DeepSeek worlds, agents powered by Claude stood in 105 elections and won 44, while DeepSeek agents stood 462 times and won 269. DeepSeek therefore held 86 percent of the terms filled, against its 82 percent share of candidacies. The gap is mainly one of candidacy: DeepSeek agents stood far more often, and the win rate per candidacy was 58 percent for DeepSeek and 42 percent for Claude.</w:t>
+      </w:r>
+    </w:p>
+    <w:p>
+      <w:pPr>
+        <w:pStyle w:val="BodyText"/>
+      </w:pPr>
+      <w:r>
+        <w:t xml:space="preserve">The capability contrast within one model family points the same way. The stronger DeepSeek V4 Pro stood 246 times and won 121; the weaker V4 Flash stood 161 times and won 56. Given who stood in each election, a random draw among the candidates would have given Pro 112.4 victories, against 121 observed (standard deviation 4.1; z = 2.1). Most of Pro’s advantage is therefore accounted for by its greater willingness to stand, and a smaller excess of about nine victories remains once candidacy is taken into account. That excess is borderline, and the z-value treats elections as independent, which they are not, so it should be read as suggestive. P5 is supported as regards selection into candidacy, and only weakly as regards success once standing.</w:t>
       </w:r>
     </w:p>
     <w:bookmarkEnd w:id="36"/>

</xml_diff>

<commit_message>
Add conceptual model figures with descriptions to manuscript
Co-Authored-By: Claude Sonnet 5.5 <noreply@anthropic.com>
Claude-Session: https://claude.ai/code/session_01Hv17up5m6zhCqJ5SAWN1gB
</commit_message>
<xml_diff>
--- a/isr_draft/ISR_manuscript_draft.docx
+++ b/isr_draft/ISR_manuscript_draft.docx
@@ -204,7 +204,7 @@
       </w:r>
     </w:p>
     <w:bookmarkEnd w:id="21"/>
-    <w:bookmarkStart w:id="26" w:name="theoretical-background-and-propositions"/>
+    <w:bookmarkStart w:id="29" w:name="theoretical-background-and-propositions"/>
     <w:p>
       <w:pPr>
         <w:pStyle w:val="Heading1"/>
@@ -301,7 +301,7 @@
       </w:r>
     </w:p>
     <w:bookmarkEnd w:id="24"/>
-    <w:bookmarkStart w:id="25" w:name="propositions"/>
+    <w:bookmarkStart w:id="28" w:name="propositions"/>
     <w:p>
       <w:pPr>
         <w:pStyle w:val="Heading2"/>
@@ -405,6 +405,79 @@
         <w:pStyle w:val="BodyText"/>
       </w:pPr>
       <w:r>
+        <w:t xml:space="preserve">Figure 1 summarizes the model. The design features on the left are the manipulated factors: office rents, authority binding, the election rule, and the capability or family of the model that drives each agent. The central construct is candidacy and electoral competition, which we expect office rents to raise (P1) and which we expect in turn to lengthen the persistence of control over the office. Authority binding is expected to raise inequality of access to tasks (P2), and the dotted arrow indicates that office rents are expected to strengthen that relationship (P3), because rents give holders a reason to use authority to their own advantage. The election rule is expected to shorten the persistence of control (P4). Agent capability and model family are expected to affect which agents hold office (P5). The model is deliberately parsimonious: it contains no mediating variables beyond candidacy, and it treats the three outcomes (persistence, inequality, and identity of the holder) as separate.</w:t>
+      </w:r>
+    </w:p>
+    <w:p>
+      <w:pPr>
+        <w:pStyle w:val="CaptionedFigure"/>
+      </w:pPr>
+      <w:r>
+        <w:drawing>
+          <wp:inline>
+            <wp:extent cx="5334000" cy="3006436"/>
+            <wp:effectExtent b="0" l="0" r="0" t="0"/>
+            <wp:docPr descr="Figure 1. Conceptual model and propositions. Solid arrows are main-effect propositions; the dotted arrow is the moderation of the authority effect by office rents (P3). Signs show the predicted direction." title="" id="26" name="Picture"/>
+            <a:graphic>
+              <a:graphicData uri="http://schemas.openxmlformats.org/drawingml/2006/picture">
+                <pic:pic>
+                  <pic:nvPicPr>
+                    <pic:cNvPr descr="figure1.png" id="27" name="Picture"/>
+                    <pic:cNvPicPr>
+                      <a:picLocks noChangeArrowheads="1" noChangeAspect="1"/>
+                    </pic:cNvPicPr>
+                  </pic:nvPicPr>
+                  <pic:blipFill>
+                    <a:blip r:embed="rId25"/>
+                    <a:stretch>
+                      <a:fillRect/>
+                    </a:stretch>
+                  </pic:blipFill>
+                  <pic:spPr bwMode="auto">
+                    <a:xfrm>
+                      <a:off x="0" y="0"/>
+                      <a:ext cx="5334000" cy="3006436"/>
+                    </a:xfrm>
+                    <a:prstGeom prst="rect">
+                      <a:avLst/>
+                    </a:prstGeom>
+                    <a:noFill/>
+                    <a:ln w="9525">
+                      <a:noFill/>
+                      <a:headEnd/>
+                      <a:tailEnd/>
+                    </a:ln>
+                  </pic:spPr>
+                </pic:pic>
+              </a:graphicData>
+            </a:graphic>
+          </wp:inline>
+        </w:drawing>
+      </w:r>
+    </w:p>
+    <w:p>
+      <w:pPr>
+        <w:pStyle w:val="ImageCaption"/>
+      </w:pPr>
+      <w:r>
+        <w:rPr>
+          <w:bCs/>
+          <w:b/>
+        </w:rPr>
+        <w:t xml:space="preserve">Figure 1. Conceptual model and propositions.</w:t>
+      </w:r>
+      <w:r>
+        <w:t xml:space="preserve"> </w:t>
+      </w:r>
+      <w:r>
+        <w:t xml:space="preserve">Solid arrows are main-effect propositions; the dotted arrow is the moderation of the authority effect by office rents (P3). Signs show the predicted direction.</w:t>
+      </w:r>
+    </w:p>
+    <w:p>
+      <w:pPr>
+        <w:pStyle w:val="BodyText"/>
+      </w:pPr>
+      <w:r>
         <w:t xml:space="preserve">We also examine</w:t>
       </w:r>
       <w:r>
@@ -421,9 +494,9 @@
         <w:t xml:space="preserve">, the extent to which a vote can be exchanged for access, as a within-world phenomenon and not a manipulated factor. Section 4.5 reports a placebo test of whether voters favor candidates who have given them promises or transfers.</w:t>
       </w:r>
     </w:p>
-    <w:bookmarkEnd w:id="25"/>
-    <w:bookmarkEnd w:id="26"/>
-    <w:bookmarkStart w:id="32" w:name="method"/>
+    <w:bookmarkEnd w:id="28"/>
+    <w:bookmarkEnd w:id="29"/>
+    <w:bookmarkStart w:id="35" w:name="method"/>
     <w:p>
       <w:pPr>
         <w:pStyle w:val="Heading1"/>
@@ -432,7 +505,7 @@
         <w:t xml:space="preserve">3. Method</w:t>
       </w:r>
     </w:p>
-    <w:bookmarkStart w:id="27" w:name="environment"/>
+    <w:bookmarkStart w:id="30" w:name="environment"/>
     <w:p>
       <w:pPr>
         <w:pStyle w:val="Heading2"/>
@@ -457,8 +530,8 @@
         <w:t xml:space="preserve">All economic relations are identified from logged, state-changing events (transfers, promises, votes, allocations). Agent messages are logged but not used to measure outcomes.</w:t>
       </w:r>
     </w:p>
-    <w:bookmarkEnd w:id="27"/>
-    <w:bookmarkStart w:id="28" w:name="design"/>
+    <w:bookmarkEnd w:id="30"/>
+    <w:bookmarkStart w:id="31" w:name="design"/>
     <w:p>
       <w:pPr>
         <w:pStyle w:val="Heading2"/>
@@ -475,8 +548,8 @@
         <w:t xml:space="preserve">The main design crosses four factors: authority (binding or advisory), election rule (plurality or ranked-choice), population (all Claude Haiku 5.5; all DeepSeek V4 Pro; or three of each), and office rent (zero or two extra energy per day in office). This gives 24 cells, each run with six seeds, for 144 worlds. A second, capability-contrast design places DeepSeek V4 Flash and V4 Pro agents together in the same world, crossing authority with office rent over six seeds (24 worlds). The within-family contrast separates capability from model family. Models were accessed through OpenRouter at a sampling temperature of 1.0, with hidden reasoning disabled so that responses are direct actions.</w:t>
       </w:r>
     </w:p>
-    <w:bookmarkEnd w:id="28"/>
-    <w:bookmarkStart w:id="29" w:name="measures"/>
+    <w:bookmarkEnd w:id="31"/>
+    <w:bookmarkStart w:id="32" w:name="measures"/>
     <w:p>
       <w:pPr>
         <w:pStyle w:val="Heading2"/>
@@ -580,8 +653,8 @@
         <w:t xml:space="preserve">The fraction of access promises later honored.</w:t>
       </w:r>
     </w:p>
-    <w:bookmarkEnd w:id="29"/>
-    <w:bookmarkStart w:id="30" w:name="analysis"/>
+    <w:bookmarkEnd w:id="32"/>
+    <w:bookmarkStart w:id="33" w:name="analysis"/>
     <w:p>
       <w:pPr>
         <w:pStyle w:val="Heading2"/>
@@ -598,8 +671,8 @@
         <w:t xml:space="preserve">We compare levels of each factor with two-sided permutation tests (10,000 permutations) using the world as the unit of analysis. The design is balanced, so these marginal comparisons are valid, although they do not adjust for the other factors and so lose power. We ran about thirty such tests and applied no multiplicity correction. Results with p-values between 0.02 and 0.05 should be read as exploratory. As a benchmark for inequality, we simulated 2,000 worlds in which two of six agents are drawn at random each day; the expected Gini was 0.103 and the expected longest spell without a task was 12.0 days.</w:t>
       </w:r>
     </w:p>
-    <w:bookmarkEnd w:id="30"/>
-    <w:bookmarkStart w:id="31" w:name="research-transparency"/>
+    <w:bookmarkEnd w:id="33"/>
+    <w:bookmarkStart w:id="34" w:name="research-transparency"/>
     <w:p>
       <w:pPr>
         <w:pStyle w:val="Heading2"/>
@@ -616,9 +689,9 @@
         <w:t xml:space="preserve">The design evolved over three stages. An initial 24-world pilot revealed that a task-request step in the advisory condition produced an artifact: agents adopted informal rotation rules, tasks went unfilled, and inequality in that condition reflected lost tasks and not governance. The request step was removed. A second 24-world pilot, run with the corrected design, showed that most elections had no candidate and that incumbents therefore persisted by default. We changed the rule so that an empty election vacates the office, and added the office-rent factor and the placebo gifted-vote measure. The pilots informed the final design and are not pooled with the main results. The main design was first run with three seeds per cell; three further seeds were added after an initial look at those results, because several differences were borderline, and all 144 worlds are analyzed together. The stopping decision was therefore not fixed in advance, and readers should treat borderline p-values accordingly. The design, models, and all analysis code are retained in a repository, and per-call costs are logged.</w:t>
       </w:r>
     </w:p>
-    <w:bookmarkEnd w:id="31"/>
-    <w:bookmarkEnd w:id="32"/>
-    <w:bookmarkStart w:id="38" w:name="results"/>
+    <w:bookmarkEnd w:id="34"/>
+    <w:bookmarkEnd w:id="35"/>
+    <w:bookmarkStart w:id="41" w:name="results"/>
     <w:p>
       <w:pPr>
         <w:pStyle w:val="Heading1"/>
@@ -627,7 +700,7 @@
         <w:t xml:space="preserve">4. Results</w:t>
       </w:r>
     </w:p>
-    <w:bookmarkStart w:id="33" w:name="competition-for-office"/>
+    <w:bookmarkStart w:id="36" w:name="competition-for-office"/>
     <w:p>
       <w:pPr>
         <w:pStyle w:val="Heading2"/>
@@ -1899,8 +1972,8 @@
         </w:tc>
       </w:tr>
     </w:tbl>
-    <w:bookmarkEnd w:id="33"/>
-    <w:bookmarkStart w:id="34" w:name="authority-and-access"/>
+    <w:bookmarkEnd w:id="36"/>
+    <w:bookmarkStart w:id="37" w:name="authority-and-access"/>
     <w:p>
       <w:pPr>
         <w:pStyle w:val="Heading2"/>
@@ -1925,8 +1998,8 @@
         <w:t xml:space="preserve">The proposed interaction between authority and rents (P3) received only weak support. For the Gini of tasks the interaction was negligible (difference in differences of 0.008; permutation p = 0.60). For the longest spell without a task, binding authority shortened exclusion by about two days when office carried no rents (9.9 against 12.0 days) but not at all when it did (12.5 against 12.0 days). The difference in differences is 2.6 days (permutation p = 0.055, bootstrap interval from −0.1 to 5.3). We read this as suggestive and not as established.</w:t>
       </w:r>
     </w:p>
-    <w:bookmarkEnd w:id="34"/>
-    <w:bookmarkStart w:id="35" w:name="election-rules"/>
+    <w:bookmarkEnd w:id="37"/>
+    <w:bookmarkStart w:id="38" w:name="election-rules"/>
     <w:p>
       <w:pPr>
         <w:pStyle w:val="Heading2"/>
@@ -1943,8 +2016,8 @@
         <w:t xml:space="preserve">Plurality and ranked-choice produced indistinguishable outcomes on every measure we examined (all p ≥ 0.22; Table 1). The largest gap was in re-election (0.32 under plurality, 0.38 under ranked-choice), in the direction opposite to P4, and it is not distinguishable from noise at this sample size.</w:t>
       </w:r>
     </w:p>
-    <w:bookmarkEnd w:id="35"/>
-    <w:bookmarkStart w:id="36" w:name="who-takes-office"/>
+    <w:bookmarkEnd w:id="38"/>
+    <w:bookmarkStart w:id="39" w:name="who-takes-office"/>
     <w:p>
       <w:pPr>
         <w:pStyle w:val="Heading2"/>
@@ -1969,8 +2042,8 @@
         <w:t xml:space="preserve">The capability contrast within one model family points the same way. The stronger DeepSeek V4 Pro stood 246 times and won 121; the weaker V4 Flash stood 161 times and won 56. Given who stood in each election, a random draw among the candidates would have given Pro 112.4 victories, against 121 observed (standard deviation 4.1; z = 2.1). Most of Pro’s advantage is therefore accounted for by its greater willingness to stand, and a smaller excess of about nine victories remains once candidacy is taken into account. That excess is borderline, and the z-value treats elections as independent, which they are not, so it should be read as suggestive. P5 is supported as regards selection into candidacy, and only weakly as regards success once standing.</w:t>
       </w:r>
     </w:p>
-    <w:bookmarkEnd w:id="36"/>
-    <w:bookmarkStart w:id="37" w:name="vote-for-access-exchange"/>
+    <w:bookmarkEnd w:id="39"/>
+    <w:bookmarkStart w:id="40" w:name="vote-for-access-exchange"/>
     <w:p>
       <w:pPr>
         <w:pStyle w:val="Heading2"/>
@@ -1987,9 +2060,9 @@
         <w:t xml:space="preserve">Office rents raised the count of voters who backed a winner after receiving a gift from that winner (5.8 against 11.5, p &lt; 0.001), which could be taken as evidence of vote buying. The placebo comparison does not support that reading. In the 110 worlds with votes for both a winner and a non-winner, gifted-vote shares were higher for the winner in 58 worlds and for the non-winner in 50 (two ties), with a mean difference of −0.013. The exchange counts correlate with the volume of transfers in a world (r = 0.67) but not with the number of promises (r = −0.07). Agents who exchange resources freely will often have given something to those who later vote for them, whether or not votes were the object. The count is therefore a poor indicator of an exchange of votes for access, and in our data we cannot distinguish the two.</w:t>
       </w:r>
     </w:p>
-    <w:bookmarkEnd w:id="37"/>
-    <w:bookmarkEnd w:id="38"/>
-    <w:bookmarkStart w:id="43" w:name="discussion"/>
+    <w:bookmarkEnd w:id="40"/>
+    <w:bookmarkEnd w:id="41"/>
+    <w:bookmarkStart w:id="49" w:name="discussion"/>
     <w:p>
       <w:pPr>
         <w:pStyle w:val="Heading1"/>
@@ -1998,7 +2071,7 @@
         <w:t xml:space="preserve">5. Discussion</w:t>
       </w:r>
     </w:p>
-    <w:bookmarkStart w:id="39" w:name="what-the-results-say"/>
+    <w:bookmarkStart w:id="45" w:name="what-the-results-say"/>
     <w:p>
       <w:pPr>
         <w:pStyle w:val="Heading2"/>
@@ -2023,8 +2096,81 @@
         <w:t xml:space="preserve">The observation that agents often held office for stretches of ten days or more is easily over-read. A considerable part of that persistence in the pilot reflected incumbents continuing by default when nobody stood. After correcting for this, the longest holder spells (8.1 to 12.4 days, against terms of five days) correspond to two or three consecutive terms, which is moderate.</w:t>
       </w:r>
     </w:p>
-    <w:bookmarkEnd w:id="39"/>
-    <w:bookmarkStart w:id="40" w:name="implications-for-governance-design"/>
+    <w:p>
+      <w:pPr>
+        <w:pStyle w:val="BodyText"/>
+      </w:pPr>
+      <w:r>
+        <w:t xml:space="preserve">Figure 2 maps the results onto the same structure. Of the five propositions, P1 is supported, P5 is supported with respect to who stands and only weakly with respect to who wins, and P4 is not supported. P2 is contradicted: binding authority reduced inequality of access measured by the Gini coefficient and did not affect the persistence of control. P3 receives only suggestive support, in the form of a loss of the exclusion benefit under rents. We did not test mediation through candidacy, so the path from rents through competition to persistence is inferred from the main effects and not estimated.</w:t>
+      </w:r>
+    </w:p>
+    <w:p>
+      <w:pPr>
+        <w:pStyle w:val="CaptionedFigure"/>
+      </w:pPr>
+      <w:r>
+        <w:drawing>
+          <wp:inline>
+            <wp:extent cx="5334000" cy="3006436"/>
+            <wp:effectExtent b="0" l="0" r="0" t="0"/>
+            <wp:docPr descr="Figure 2. Empirical support for the model (168 worlds). Solid arrows indicate supported effects, dashed grey arrows no detectable effect, and the dotted arrow a weak or suggestive moderation. Authority binding had no detectable effect on persistence of control. Mediation by candidacy was not tested." title="" id="43" name="Picture"/>
+            <a:graphic>
+              <a:graphicData uri="http://schemas.openxmlformats.org/drawingml/2006/picture">
+                <pic:pic>
+                  <pic:nvPicPr>
+                    <pic:cNvPr descr="figure2.png" id="44" name="Picture"/>
+                    <pic:cNvPicPr>
+                      <a:picLocks noChangeArrowheads="1" noChangeAspect="1"/>
+                    </pic:cNvPicPr>
+                  </pic:nvPicPr>
+                  <pic:blipFill>
+                    <a:blip r:embed="rId42"/>
+                    <a:stretch>
+                      <a:fillRect/>
+                    </a:stretch>
+                  </pic:blipFill>
+                  <pic:spPr bwMode="auto">
+                    <a:xfrm>
+                      <a:off x="0" y="0"/>
+                      <a:ext cx="5334000" cy="3006436"/>
+                    </a:xfrm>
+                    <a:prstGeom prst="rect">
+                      <a:avLst/>
+                    </a:prstGeom>
+                    <a:noFill/>
+                    <a:ln w="9525">
+                      <a:noFill/>
+                      <a:headEnd/>
+                      <a:tailEnd/>
+                    </a:ln>
+                  </pic:spPr>
+                </pic:pic>
+              </a:graphicData>
+            </a:graphic>
+          </wp:inline>
+        </w:drawing>
+      </w:r>
+    </w:p>
+    <w:p>
+      <w:pPr>
+        <w:pStyle w:val="ImageCaption"/>
+      </w:pPr>
+      <w:r>
+        <w:rPr>
+          <w:bCs/>
+          <w:b/>
+        </w:rPr>
+        <w:t xml:space="preserve">Figure 2. Empirical support for the model (168 worlds).</w:t>
+      </w:r>
+      <w:r>
+        <w:t xml:space="preserve"> </w:t>
+      </w:r>
+      <w:r>
+        <w:t xml:space="preserve">Solid arrows indicate supported effects, dashed grey arrows no detectable effect, and the dotted arrow a weak or suggestive moderation. Authority binding had no detectable effect on persistence of control. Mediation by candidacy was not tested.</w:t>
+      </w:r>
+    </w:p>
+    <w:bookmarkEnd w:id="45"/>
+    <w:bookmarkStart w:id="46" w:name="implications-for-governance-design"/>
     <w:p>
       <w:pPr>
         <w:pStyle w:val="Heading2"/>
@@ -2041,8 +2187,8 @@
         <w:t xml:space="preserve">Three implications follow, with the caution that they derive from a single simulated environment. First, designers who wish to limit contention over control of an agent system should look at the incentives attached to the role before the powers attached to it. Second, binding authority was not harmful here, and may have been protective, in the sense that holders distributed access more evenly than a lottery would. This should not be generalized to settings where holders have private interests that conflict with those of the agents they allocate to. Third, measures of exchange based on co-occurrence, such as a gift followed by a vote, require a benchmark. Without our placebo comparison we would have reported evidence of vote buying where the data show only a high base rate of giving.</w:t>
       </w:r>
     </w:p>
-    <w:bookmarkEnd w:id="40"/>
-    <w:bookmarkStart w:id="41" w:name="limitations"/>
+    <w:bookmarkEnd w:id="46"/>
+    <w:bookmarkStart w:id="47" w:name="limitations"/>
     <w:p>
       <w:pPr>
         <w:pStyle w:val="Heading2"/>
@@ -2059,8 +2205,8 @@
         <w:t xml:space="preserve">The environment is small: six agents, 50 days, two tasks per day, and a single prompt framing. The agents had no heterogeneous interests beyond energy and no means of coercion or exclusion beyond the allocation itself. Public reputation records, which the platform supports, were not varied. Outcomes depend on the specific models and on a sampling temperature of 1.0; both are snapshots, and different versions may behave differently. Our permutation tests are marginal and uncorrected for multiple comparisons, and the three seeds per cell limit what can be said about interactions. We did not vary initial endowments, so the part of the capability proposition concerning initial resources is untested. The selection of candidacy over winning in Section 4.4 rests on a null-model comparison that treats elections as independent. Finally, the findings come from simulated agents, and no claim is made that human actors, or agents embedded in organizations, would behave in the same way. A human benchmark in the same environment would be the most informative extension.</w:t>
       </w:r>
     </w:p>
-    <w:bookmarkEnd w:id="41"/>
-    <w:bookmarkStart w:id="42" w:name="future-research"/>
+    <w:bookmarkEnd w:id="47"/>
+    <w:bookmarkStart w:id="48" w:name="future-research"/>
     <w:p>
       <w:pPr>
         <w:pStyle w:val="Heading2"/>
@@ -2077,9 +2223,9 @@
         <w:t xml:space="preserve">Several extensions follow from these limits: larger populations and tighter scarcity, where competition for access is harder to resolve by rotation; heterogeneous endowments and interests; accountability mechanisms such as public records; and comparison with human participants in the same game. Studying how agents formed the informal rotation norms we observed in early pilots is a further direction, since such norms may be an important and under-studied form of self-governance among agents.</w:t>
       </w:r>
     </w:p>
-    <w:bookmarkEnd w:id="42"/>
-    <w:bookmarkEnd w:id="43"/>
-    <w:bookmarkStart w:id="44" w:name="conclusion"/>
+    <w:bookmarkEnd w:id="48"/>
+    <w:bookmarkEnd w:id="49"/>
+    <w:bookmarkStart w:id="50" w:name="conclusion"/>
     <w:p>
       <w:pPr>
         <w:pStyle w:val="Heading1"/>
@@ -2096,8 +2242,8 @@
         <w:t xml:space="preserve">We asked when LLM agents sharing scarce resources seek and keep control over allocation, and whether control becomes capture. In a controlled simulation of 168 worlds, the rewards attached to office determined whether agents competed for it, binding authority led to a more equal distribution of tasks than chance, election rules made no detectable difference, and stronger models were more active in seeking office. Where concentration appeared, it was concentration of office, not of access. For the designers of agentic systems, the primary design lever is the value attached to a role, and the evidence for capture by authority is, so far, weak.</w:t>
       </w:r>
     </w:p>
-    <w:bookmarkEnd w:id="44"/>
-    <w:bookmarkStart w:id="45" w:name="references"/>
+    <w:bookmarkEnd w:id="50"/>
+    <w:bookmarkStart w:id="51" w:name="references"/>
     <w:p>
       <w:pPr>
         <w:pStyle w:val="Heading1"/>
@@ -2499,7 +2645,7 @@
         <w:t xml:space="preserve">arXiv:2608.03076.</w:t>
       </w:r>
     </w:p>
-    <w:bookmarkEnd w:id="45"/>
+    <w:bookmarkEnd w:id="51"/>
     <w:sectPr/>
   </w:body>
 </w:document>

</xml_diff>